<commit_message>
S6 take-home: the Five-Minute Examen explained on the sheet (John's call) — the three steps (thank, notice, ask) added under the week-one practice, md record + Word rendition, matching deck slide 12; changelog v2.12; the two-weeks vs quarter-break/Pulse frame divergence flagged for John's call
Co-Authored-By: Claude Fable 5 <noreply@anthropic.com>
</commit_message>
<xml_diff>
--- a/_implementation-notes/evening-series/handouts/FotH Pilot Session 6 Homework Handout DRAFT v1.docx
+++ b/_implementation-notes/evening-series/handouts/FotH Pilot Session 6 Homework Handout DRAFT v1.docx
@@ -469,7 +469,47 @@
       <w:r>
         <w:t>The Five-Minute Examen each evening — carried through the two weeks.</w:t>
       </w:r>
-      <w:r/>
+    </w:p>
+    <w:p>
+      <w:pPr>
+        <w:pStyle w:val="BodyText"/>
+      </w:pPr>
+      <w:r>
+        <w:rPr>
+          <w:b/>
+        </w:rPr>
+        <w:t xml:space="preserve">The Five-Minute Examen — how to do it. </w:t>
+      </w:r>
+      <w:r>
+        <w:t>Five minutes with God each evening, before bed:</w:t>
+      </w:r>
+    </w:p>
+    <w:p>
+      <w:pPr>
+        <w:pStyle w:val="BodyText"/>
+        <w:ind w:left="360"/>
+      </w:pPr>
+      <w:r>
+        <w:t>1. Thank Him for one specific thing from the day.</w:t>
+      </w:r>
+    </w:p>
+    <w:p>
+      <w:pPr>
+        <w:pStyle w:val="BodyText"/>
+        <w:ind w:left="360"/>
+      </w:pPr>
+      <w:r>
+        <w:t>2. Notice one place where you saw God moving.</w:t>
+      </w:r>
+    </w:p>
+    <w:p>
+      <w:pPr>
+        <w:pStyle w:val="BodyText"/>
+        <w:ind w:left="360"/>
+      </w:pPr>
+      <w:r>
+        <w:t>3. Ask Him about one place where you walked in less honesty than you wanted to today — just notice. No fixing; the Spirit does the work.</w:t>
+      </w:r>
     </w:p>
     <w:bookmarkEnd w:id="9"/>
     <w:bookmarkStart w:id="10" w:name="the-end-of-week-one-check-in"/>
@@ -486,10 +526,7 @@
         <w:pStyle w:val="FirstParagraph"/>
       </w:pPr>
       <w:r>
-        <w:t xml:space="preserve">My check-in partner for this cycle is:</w:t>
-      </w:r>
-      <w:r>
-        <w:t xml:space="preserve"> </w:t>
+        <w:t xml:space="preserve">My check-in partner for this cycle is: </w:t>
       </w:r>
       <w:r>
         <w:rPr>
@@ -514,22 +551,7 @@
         <w:pStyle w:val="BodyText"/>
       </w:pPr>
       <w:r>
-        <w:t xml:space="preserve">At the end of week one, connect with your partner and report how it’s going</w:t>
-      </w:r>
-      <w:r>
-        <w:t xml:space="preserve"> </w:t>
-      </w:r>
-      <w:r>
-        <w:t xml:space="preserve">against the practice. A text, a call, or a hallway conversation all count.</w:t>
-      </w:r>
-      <w:r>
-        <w:t xml:space="preserve"> </w:t>
-      </w:r>
-      <w:r>
-        <w:t xml:space="preserve">You are not grading each other; you are expecting each other.</w:t>
-      </w:r>
-      <w:r>
-        <w:t xml:space="preserve"> </w:t>
+        <w:t xml:space="preserve">At the end of week one, connect with your partner and report how it’s going against the practice. A text, a call, or a hallway conversation all count. You are not grading each other; you are expecting each other. </w:t>
       </w:r>
       <w:r>
         <w:rPr>
@@ -539,10 +561,7 @@
         <w:t xml:space="preserve">Done:</w:t>
       </w:r>
       <w:r>
-        <w:t xml:space="preserve"> </w:t>
-      </w:r>
-      <w:r>
-        <w:t xml:space="preserve">☐</w:t>
+        <w:t xml:space="preserve"> ☐</w:t>
       </w:r>
     </w:p>
     <w:bookmarkEnd w:id="10"/>
@@ -560,13 +579,7 @@
         <w:pStyle w:val="FirstParagraph"/>
       </w:pPr>
       <w:r>
-        <w:t xml:space="preserve">Continue or deepen the same practice, as the session specifies; journal</w:t>
-      </w:r>
-      <w:r>
-        <w:t xml:space="preserve"> </w:t>
-      </w:r>
-      <w:r>
-        <w:t xml:space="preserve">what happens.</w:t>
+        <w:t xml:space="preserve">Continue or deepen the same practice, as the session specifies; journal what happens.</w:t>
       </w:r>
     </w:p>
     <w:bookmarkEnd w:id="11"/>
@@ -584,10 +597,7 @@
         <w:pStyle w:val="FirstParagraph"/>
       </w:pPr>
       <w:r>
-        <w:t xml:space="preserve">Set at commissioning from the session’s materials.</w:t>
-      </w:r>
-      <w:r>
-        <w:t xml:space="preserve"> </w:t>
+        <w:t xml:space="preserve">Set at commissioning from the session’s materials. </w:t>
       </w:r>
       <w:r>
         <w:rPr>
@@ -597,10 +607,7 @@
         <w:t xml:space="preserve">Done:</w:t>
       </w:r>
       <w:r>
-        <w:t xml:space="preserve"> </w:t>
-      </w:r>
-      <w:r>
-        <w:t xml:space="preserve">☐</w:t>
+        <w:t xml:space="preserve"> ☐</w:t>
       </w:r>
     </w:p>
     <w:p>

</xml_diff>